<commit_message>
Industrial Air Compressor Uploaded with detail sheet sequence wise
Bhai detail sheet m serial se jese mentioned h wese hi upload krna
AIse hi folder bana dena us k ander sari product use krna
</commit_message>
<xml_diff>
--- a/Issues.docx
+++ b/Issues.docx
@@ -5,61 +5,21 @@
     <w:p>
       <w:pPr>
         <w:rPr>
-          <w:lang w:val="en-US"/>
+          <w:b/>
+          <w:bCs/>
         </w:rPr>
       </w:pPr>
       <w:r>
-        <w:rPr>
-          <w:lang w:val="en-US"/>
-        </w:rPr>
         <w:t xml:space="preserve">1) </w:t>
       </w:r>
       <w:r>
-        <w:rPr>
-          <w:lang w:val="en-US"/>
-        </w:rPr>
         <w:t>Download all CDNs</w:t>
       </w:r>
       <w:r>
-        <w:rPr>
-          <w:lang w:val="en-US"/>
-        </w:rPr>
         <w:br/>
       </w:r>
       <w:r>
-        <w:rPr>
-          <w:lang w:val="en-US"/>
-        </w:rPr>
         <w:br/>
-        <w:t xml:space="preserve">Compressor wale part m jo detail file pr h </w:t>
-      </w:r>
-      <w:proofErr w:type="spellStart"/>
-      <w:r>
-        <w:rPr>
-          <w:lang w:val="en-US"/>
-        </w:rPr>
-        <w:t>wohi</w:t>
-      </w:r>
-      <w:proofErr w:type="spellEnd"/>
-      <w:r>
-        <w:rPr>
-          <w:lang w:val="en-US"/>
-        </w:rPr>
-        <w:t xml:space="preserve"> </w:t>
-      </w:r>
-      <w:proofErr w:type="spellStart"/>
-      <w:r>
-        <w:rPr>
-          <w:lang w:val="en-US"/>
-        </w:rPr>
-        <w:t>likhni</w:t>
-      </w:r>
-      <w:proofErr w:type="spellEnd"/>
-      <w:r>
-        <w:rPr>
-          <w:lang w:val="en-US"/>
-        </w:rPr>
-        <w:t xml:space="preserve"> h</w:t>
       </w:r>
     </w:p>
     <w:sectPr>
@@ -81,7 +41,7 @@
         <w:kern w:val="2"/>
         <w:sz w:val="24"/>
         <w:szCs w:val="24"/>
-        <w:lang w:eastAsia="en-US" w:bidi="ar-SA"/>
+        <w:lang w:val="en-US" w:eastAsia="en-US" w:bidi="ar-SA"/>
         <w14:ligatures w14:val="standardContextual"/>
       </w:rPr>
     </w:rPrDefault>

</xml_diff>